<commit_message>
Développer la fiche d’histoire en paragraphes explicatifs
Reprendre la présentation des fiches fournies et expliquer les mécanismes du CM actuel jusqu’au CM5. Conserver les 302 paragraphes et renvois, les définitions et la chronologie, avec l’archive séparée. Fiche de 17 pages relue après rendu.
</commit_message>
<xml_diff>
--- a/documents/histoire-fiche.docx
+++ b/documents/histoire-fiche.docx
@@ -138,42 +138,34 @@
     </w:p>
     <w:p>
       <w:pPr>
-        <w:pStyle w:val="ListBullet"/>
-        <w:pageBreakBefore w:val="0"/>
-        <w:spacing w:after="40"/>
-      </w:pPr>
-      <w:r>
-        <w:t xml:space="preserve">Royauté : 753–509 av. J.-C. dans la chronologie traditionnelle. La fondation de Rome en 753 est un repère légendaire, non une date historiquement démontrée.</w:t>
-      </w:r>
-    </w:p>
-    <w:p>
-      <w:pPr>
-        <w:pStyle w:val="ListBullet"/>
-        <w:pageBreakBefore w:val="0"/>
-        <w:spacing w:after="40"/>
-      </w:pPr>
-      <w:r>
-        <w:t xml:space="preserve">République : 509–27 av. J.-C. Elle associe magistratures, Sénat et assemblées populaires ; elle n’est pas une démocratie au sens contemporain.</w:t>
-      </w:r>
-    </w:p>
-    <w:p>
-      <w:pPr>
-        <w:pStyle w:val="ListBullet"/>
-        <w:pageBreakBefore w:val="0"/>
-        <w:spacing w:after="40"/>
-      </w:pPr>
-      <w:r>
-        <w:t xml:space="preserve">Principat : à partir de 27 av. J.-C., lorsque Octave reçoit le titre d’Auguste. Les formes républicaines subsistent tandis que le pouvoir se concentre autour du princeps.</w:t>
-      </w:r>
-    </w:p>
-    <w:p>
-      <w:pPr>
-        <w:pStyle w:val="ListBullet"/>
-        <w:pageBreakBefore w:val="0"/>
-        <w:spacing w:after="40"/>
-      </w:pPr>
-      <w:r>
-        <w:t xml:space="preserve">Repères de l’histoire du droit dans le cours : droit classique environ 130 av. J.-C.–230 apr. J.-C. ; droit tardif environ 230–530. Ces bornes juridiques ne se confondent pas avec les changements de régime politique.</w:t>
+        <w:pageBreakBefore w:val="0"/>
+      </w:pPr>
+      <w:r>
+        <w:t xml:space="preserve">La royauté constitue la première période politique dans la chronologie traditionnelle, de 753 à 509 av. J.-C. Ces dates servent à se repérer ; la fondation de Rome en 753 relève d’une tradition légendaire et ne constitue pas une date historiquement démontrée. Pour comprendre les sources du droit, l’essentiel est de retenir une société où les pratiques coutumières et les fonctions religieuses occupent une place importante. Il ne faut donc pas imaginer, dès cette période, un législateur produisant un code comparable aux codes actuels.</w:t>
+      </w:r>
+    </w:p>
+    <w:p>
+      <w:pPr>
+        <w:pageBreakBefore w:val="0"/>
+      </w:pPr>
+      <w:r>
+        <w:t xml:space="preserve">La République, traditionnellement située entre 509 et 27 av. J.-C., associe plusieurs centres de décision : les magistratures, le Sénat et les assemblées populaires. Cette répartition permet de comprendre pourquoi le droit ne vient pas d’une seule autorité. Les lois votées par les assemblées coexistent avec la coutume et avec l’influence du Sénat. La présence d’assemblées ne suffit pas à qualifier le régime de démocratie contemporaine : les droits de participation, les conditions sociales et les rapports de pouvoir sont différents.</w:t>
+      </w:r>
+    </w:p>
+    <w:p>
+      <w:pPr>
+        <w:pageBreakBefore w:val="0"/>
+      </w:pPr>
+      <w:r>
+        <w:t xml:space="preserve">Le Principat commence traditionnellement en 27 av. J.-C., lorsque Octave reçoit le titre d’Auguste. Les institutions républicaines ne sont pas toutes supprimées : elles subsistent, mais leur autonomie et leur rôle se transforment autour du princeps. Ce maintien des formes explique qu’il faille observer l’exercice réel du pouvoir pour comprendre l’évolution du droit. L’empereur renforce progressivement son influence sur les juristes, le Sénat et la production des règles, avant que les constitutions impériales occupent une place centrale.</w:t>
+      </w:r>
+    </w:p>
+    <w:p>
+      <w:pPr>
+        <w:pageBreakBefore w:val="0"/>
+      </w:pPr>
+      <w:r>
+        <w:t xml:space="preserve">Les périodes juridiques du cours ne recouvrent pas exactement les régimes politiques. Le droit classique est situé approximativement entre 130 av. J.-C. et 230 apr. J.-C. ; le droit tardif entre environ 230 et 530. Une transformation du droit peut donc traverser la fin de la République et le début de l’Empire. Pour réviser, il faut relier une source à sa période et à sa fonction, puis préciser le contexte politique. Apprendre seulement une succession de rois ou d’empereurs ne permet pas d’expliquer les changements juridiques.</w:t>
       </w:r>
     </w:p>
     <w:p>
@@ -263,47 +255,39 @@
         <w:pageBreakBefore w:val="0"/>
       </w:pPr>
       <w:r>
-        <w:t xml:space="preserve">L’ancien droit repose largement sur des pratiques transmises oralement. Le cours oppose, à titre pédagogique, un droit horizontal issu des pratiques sociales à un droit vertical produit par une autorité instituée. La connaissance précise des « lois royales » et de leurs origines reste discutée.</w:t>
-      </w:r>
-    </w:p>
-    <w:p>
-      <w:pPr>
-        <w:pStyle w:val="ListBullet"/>
-        <w:pageBreakBefore w:val="0"/>
-        <w:spacing w:after="40"/>
-      </w:pPr>
-      <w:r>
-        <w:t xml:space="preserve">Religieux : droit, politique et religion sont étroitement liés. Les pontifes contribuent à conserver, interpréter et révéler les règles rituelles et juridiques.</w:t>
-      </w:r>
-    </w:p>
-    <w:p>
-      <w:pPr>
-        <w:pStyle w:val="ListBullet"/>
-        <w:pageBreakBefore w:val="0"/>
-        <w:spacing w:after="40"/>
-      </w:pPr>
-      <w:r>
-        <w:t xml:space="preserve">Formaliste : certains actes supposent des gestes ou des paroles solennelles. Leur respect peut déterminer la validité de l’acte. Les contrats réels et consensuels se développent ensuite, sans faire disparaître tout formalisme.</w:t>
-      </w:r>
-    </w:p>
-    <w:p>
-      <w:pPr>
-        <w:pStyle w:val="ListBullet"/>
-        <w:pageBreakBefore w:val="0"/>
-        <w:spacing w:after="40"/>
-      </w:pPr>
-      <w:r>
-        <w:t xml:space="preserve">Rural : terre, voisinage, récoltes, incendies et dommages causés par les animaux occupent une place importante dans une société de citoyens paysans-soldats.</w:t>
-      </w:r>
-    </w:p>
-    <w:p>
-      <w:pPr>
-        <w:pStyle w:val="ListBullet"/>
-        <w:pageBreakBefore w:val="0"/>
-        <w:spacing w:after="40"/>
-      </w:pPr>
-      <w:r>
-        <w:t xml:space="preserve">Familial : les droits et pouvoirs sont structurés par la famille juridique et l’autorité du paterfamilias. La famille ne se réduit pas à l’ensemble des parents par le sang.</w:t>
+        <w:t xml:space="preserve">L’ancien droit repose largement sur des pratiques transmises oralement. Le cours oppose, à titre pédagogique, un droit horizontal issu des pratiques sociales à un droit vertical produit par une autorité instituée. La connaissance précise des « lois royales » et de leurs origines reste discutée. Une règle peut ainsi être reconnue et suivie sans avoir été promulguée par une autorité unique. Pour distinguer coutume et loi, la question centrale est celle du mode de formation de la règle ; son caractère obligatoire ne dépend pas uniquement de sa mise par écrit.</w:t>
+      </w:r>
+    </w:p>
+    <w:p>
+      <w:pPr>
+        <w:pageBreakBefore w:val="0"/>
+      </w:pPr>
+      <w:r>
+        <w:t xml:space="preserve">Le caractère religieux de l’ancien droit tient à l’étroite relation entre droit, politique et religion. Les pontifes participent à la conservation et à l’interprétation des règles et des pratiques rituelles. Celui qui connaît les formes nécessaires à un acte ou à une procédure dispose ainsi d’un savoir décisif pour les autres membres de la société. L’intérêt de cette observation est de comprendre la portée ultérieure de la publicité du droit et de la laïcisation de l’activité juridique : les conditions d’accès au savoir se transforment.</w:t>
+      </w:r>
+    </w:p>
+    <w:p>
+      <w:pPr>
+        <w:pageBreakBefore w:val="0"/>
+      </w:pPr>
+      <w:r>
+        <w:t xml:space="preserve">Le formalisme signifie que la validité de certains actes dépend du respect de gestes ou de paroles solennelles. La forme n’est donc pas seulement une présentation extérieure : elle peut conditionner l’effet juridique recherché. Le rituel du bronze et de la balance, associé au nexum, illustre cette place des opérations symboliques. Les contrats réels et consensuels se développent ensuite et offrent d’autres modes de formation des rapports juridiques. Cette évolution assouplit le droit sans faire disparaître immédiatement toutes les exigences de forme.</w:t>
+      </w:r>
+    </w:p>
+    <w:p>
+      <w:pPr>
+        <w:pageBreakBefore w:val="0"/>
+      </w:pPr>
+      <w:r>
+        <w:t xml:space="preserve">Le caractère rural du droit correspond aux besoins d’une société où la terre et les activités agricoles sont essentielles. Les règles doivent organiser les rapports de voisinage, les dommages aux récoltes, les incendies ou les atteintes causées par des animaux. Ces objets montrent que les sources du droit répondent à des problèmes concrets. Pour expliquer ce caractère, il est plus utile de relier une règle à la protection des biens et de la vie rurale que de retenir seulement l’adjectif « rural ».</w:t>
+      </w:r>
+    </w:p>
+    <w:p>
+      <w:pPr>
+        <w:pageBreakBefore w:val="0"/>
+      </w:pPr>
+      <w:r>
+        <w:t xml:space="preserve">Le caractère familial renvoie à la place de la famille juridique et des puissances qui l’organisent. Les pouvoirs du paterfamilias structurent la situation des personnes placées sous son autorité. Cette famille ne se confond pas avec une simple liste de parents par le sang : une relation de puissance juridique constitue un critère essentiel. La distinction prépare celle de l’agnation et de la cognation, étudiée à propos des successions. Elle permet de comprendre pourquoi un changement de conception de la parenté peut modifier les personnes appelées à hériter.</w:t>
       </w:r>
     </w:p>
     <w:p>
@@ -404,15 +388,15 @@
         <w:pageBreakBefore w:val="0"/>
       </w:pPr>
       <w:r>
-        <w:t xml:space="preserve">La rédaction répond notamment aux tensions entre patriciens et plébéiens. Les patriciens détiennent initialement des positions privilégiées dans les magistratures et les fonctions religieuses ; les plébéiens réclament davantage de protection et d’accès aux responsabilités. La plèbe est socialement diverse et ne se réduit pas aux plus pauvres.</w:t>
-      </w:r>
-    </w:p>
-    <w:p>
-      <w:pPr>
-        <w:pageBreakBefore w:val="0"/>
-      </w:pPr>
-      <w:r>
-        <w:t xml:space="preserve">Tribuns, édiles plébéiens et concile de la plèbe participent à l’organisation des revendications. Les sécessions sont des moyens de pression collective. L’écriture et la publicité des règles rendent le droit plus connaissable et limitent l’arbitraire, mais elles n’effacent pas toutes les inégalités.</w:t>
+        <w:t xml:space="preserve">La rédaction répond notamment aux tensions entre patriciens et plébéiens. Les patriciens détiennent initialement des positions privilégiées dans les magistratures et les fonctions religieuses ; les plébéiens réclament davantage de protection et d’accès aux responsabilités. La plèbe est socialement diverse et ne se réduit pas aux plus pauvres. La demande de publicité du droit est donc liée à un rapport de pouvoir. Rendre les règles connaissables peut limiter l’avantage de ceux qui en détiennent seuls la maîtrise ; cela ne suffit toutefois pas à modifier toutes les règles de fond ou à ouvrir immédiatement toutes les responsabilités politiques.</w:t>
+      </w:r>
+    </w:p>
+    <w:p>
+      <w:pPr>
+        <w:pageBreakBefore w:val="0"/>
+      </w:pPr>
+      <w:r>
+        <w:t xml:space="preserve">Tribuns, édiles plébéiens et concile de la plèbe participent à l’organisation des revendications. Les sécessions sont des moyens de pression collective. L’écriture et la publicité des règles rendent le droit plus connaissable et limitent l’arbitraire, mais elles n’effacent pas toutes les inégalités. La distinction entre connaître la règle et obtenir un changement de la règle est ici essentielle. La publication constitue une garantie contre certaines formes d’arbitraire, tandis que les revendications sociales et politiques se poursuivent au-delà de la rédaction des Tables.</w:t>
       </w:r>
     </w:p>
     <w:p>
@@ -512,7 +496,7 @@
         <w:pageBreakBefore w:val="0"/>
       </w:pPr>
       <w:r>
-        <w:t xml:space="preserve">Le droit classique est caractérisé par le pluralisme : droit prétorien, activité des jurisconsultes, sénatus-consultes et constitutions impériales coexistent. Les institutions républicaines ne disparaissent pas instantanément avec le Principat ; leur rôle se transforme.</w:t>
+        <w:t xml:space="preserve">Le droit classique est caractérisé par le pluralisme : droit prétorien, activité des jurisconsultes, sénatus-consultes et constitutions impériales coexistent. Les institutions républicaines ne disparaissent pas instantanément avec le Principat ; leur rôle se transforme. Le pluralisme ne signifie pas que toutes les sources ont la même fonction. Certaines organisent l’accès au procès, d’autres proposent une analyse, d’autres encore expriment des décisions de l’autorité. Pour expliquer le droit classique, il faut identifier ces contributions et leur articulation.</w:t>
       </w:r>
     </w:p>
     <w:p>
@@ -591,7 +575,7 @@
         <w:pageBreakBefore w:val="0"/>
       </w:pPr>
       <w:r>
-        <w:t xml:space="preserve">L’octroi d’actions protège des situations concrètes et adapte le droit à de nouveaux besoins. Les préteurs reprennent des dispositions utiles de leurs prédécesseurs et peuvent en ajouter : cette activité forme le droit prétorien.</w:t>
+        <w:t xml:space="preserve">L’octroi d’actions protège des situations concrètes et adapte le droit à de nouveaux besoins. Les préteurs reprennent des dispositions utiles de leurs prédécesseurs et peuvent en ajouter : cette activité forme le droit prétorien. L’action rend une protection concrètement accessible. On comprend ainsi pourquoi l’évolution du droit peut passer par la manière d’organiser le procès, même sans nouvelle loi générale. Le travail du préteur accompagne l’adaptation des protections aux rapports sociaux et économiques.</w:t>
       </w:r>
     </w:p>
     <w:p>
@@ -606,22 +590,18 @@
     </w:p>
     <w:p>
       <w:pPr>
-        <w:pStyle w:val="ListBullet"/>
-        <w:pageBreakBefore w:val="0"/>
-        <w:spacing w:after="40"/>
-      </w:pPr>
-      <w:r>
-        <w:t xml:space="preserve">In iure : le préteur examine la demande, accorde ou refuse l’action, organise le procès, désigne le juge selon les règles applicables et établit la formule.</w:t>
-      </w:r>
-    </w:p>
-    <w:p>
-      <w:pPr>
-        <w:pStyle w:val="ListBullet"/>
-        <w:pageBreakBefore w:val="0"/>
-        <w:spacing w:after="40"/>
-      </w:pPr>
-      <w:r>
-        <w:t xml:space="preserve">Apud iudicem : le juge privé examine les faits et les preuves et tranche dans le cadre de la formule.</w:t>
+        <w:pageBreakBefore w:val="0"/>
+      </w:pPr>
+      <w:r>
+        <w:t xml:space="preserve">In iure : le préteur examine la demande et détermine si une protection juridictionnelle peut être accordée. Il organise le cadre du procès, désigne le juge selon les règles applicables et établit la formule. Son intervention est donc décisive pour traduire une prétention en question juridique susceptible d’être jugée. Il ne faut pas en déduire qu’il a déjà décidé que le demandeur a raison : la vérification des faits et la décision dans le cadre fixé appartiennent à l’autre phase.</w:t>
+      </w:r>
+    </w:p>
+    <w:p>
+      <w:pPr>
+        <w:pageBreakBefore w:val="0"/>
+      </w:pPr>
+      <w:r>
+        <w:t xml:space="preserve">Apud iudicem : le juge privé examine les faits et les preuves dans le cadre de la formule, puis condamne ou absout selon les conditions prévues. Exemple pédagogique : lorsqu’une dette est contestée, identifier la protection accordée et les conditions à vérifier ne signifie pas encore démontrer que la dette existe. L’articulation entre les deux phases explique la complémentarité des rôles : le préteur organise le cadre juridique et le juge tranche le litige. Ces fonctions ne correspondent pas exactement à deux degrés de juridiction contemporains.</w:t>
       </w:r>
     </w:p>
     <w:p>
@@ -695,7 +675,7 @@
         <w:pageBreakBefore w:val="0"/>
       </w:pPr>
       <w:r>
-        <w:t xml:space="preserve">L’activité juridique se laïcise progressivement par rapport à la connaissance initialement liée aux pontifes. Les jurisconsultes consultent, conseillent la rédaction d’actes et enseignent. Leur prestige social et leur auctoritas soutiennent leurs avis ; leurs solutions peuvent diverger.</w:t>
+        <w:t xml:space="preserve">L’activité juridique se laïcise progressivement par rapport à la connaissance initialement liée aux pontifes. Les jurisconsultes consultent, conseillent la rédaction d’actes et enseignent. Leur prestige social et leur auctoritas soutiennent leurs avis ; leurs solutions peuvent diverger. La force de leur contribution tient au raisonnement et à l’autorité reconnue à leur savoir. Elle doit être distinguée d’un ordre donné par un magistrat : l’avis éclaire la solution juridique, alors que le commandement impose une conduite dans le champ d’un pouvoir.</w:t>
       </w:r>
     </w:p>
     <w:p>
@@ -830,42 +810,34 @@
     </w:p>
     <w:p>
       <w:pPr>
-        <w:pStyle w:val="ListBullet"/>
-        <w:pageBreakBefore w:val="0"/>
-        <w:spacing w:after="40"/>
-      </w:pPr>
-      <w:r>
-        <w:t xml:space="preserve">Édit impérial : disposition de portée générale. Exemples : citoyenneté accordée par Caracalla en 212 ; édit du Maximum de Dioclétien en 301.</w:t>
-      </w:r>
-    </w:p>
-    <w:p>
-      <w:pPr>
-        <w:pStyle w:val="ListBullet"/>
-        <w:pageBreakBefore w:val="0"/>
-        <w:spacing w:after="40"/>
-      </w:pPr>
-      <w:r>
-        <w:t xml:space="preserve">Décret impérial : décision rendue par l’empereur dans une affaire judiciaire.</w:t>
-      </w:r>
-    </w:p>
-    <w:p>
-      <w:pPr>
-        <w:pStyle w:val="ListBullet"/>
-        <w:pageBreakBefore w:val="0"/>
-        <w:spacing w:after="40"/>
-      </w:pPr>
-      <w:r>
-        <w:t xml:space="preserve">Rescrit : réponse écrite de l’empereur à une question ou une requête juridique.</w:t>
-      </w:r>
-    </w:p>
-    <w:p>
-      <w:pPr>
-        <w:pStyle w:val="ListBullet"/>
-        <w:pageBreakBefore w:val="0"/>
-        <w:spacing w:after="40"/>
-      </w:pPr>
-      <w:r>
-        <w:t xml:space="preserve">Mandat : instruction adressée à un agent de l’administration, notamment un gouverneur provincial.</w:t>
+        <w:pageBreakBefore w:val="0"/>
+      </w:pPr>
+      <w:r>
+        <w:t xml:space="preserve">Édit impérial : il s’agit d’une décision de portée générale émanant de l’empereur. L’extension de la citoyenneté par Caracalla en 212 et l’édit du Maximum de Dioclétien en 301 constituent les exemples du cours. Le critère à retenir est la portée générale du texte, qui dépasse la réponse à un seul litige. Il faut également identifier son auteur : l’édit impérial ne remplit pas la même fonction que l’édit par lequel le préteur annonce les protections juridictionnelles qu’il accordera.</w:t>
+      </w:r>
+    </w:p>
+    <w:p>
+      <w:pPr>
+        <w:pageBreakBefore w:val="0"/>
+      </w:pPr>
+      <w:r>
+        <w:t xml:space="preserve">Décret impérial : c’est une décision rendue par l’empereur dans une affaire judiciaire. Le point de départ est donc le règlement d’un litige, et non l’annonce d’un programme juridictionnel par un magistrat. Pour distinguer les constitutions impériales, il faut demander dans quelle activité l’empereur intervient : ici, il juge. Cette origine contentieuse permet de différencier le décret du rescrit, qui répond à une question ou à une requête juridique.</w:t>
+      </w:r>
+    </w:p>
+    <w:p>
+      <w:pPr>
+        <w:pageBreakBefore w:val="0"/>
+      </w:pPr>
+      <w:r>
+        <w:t xml:space="preserve">Rescrit : il consiste dans une réponse écrite de l’empereur à une question ou à une requête juridique. Le demandeur cherche une solution ou une indication sur le droit applicable ; la réponse impériale acquiert une place dans la production du droit. Sa forme permet de comprendre comment le pouvoir central intervient dans des difficultés concrètes. Il faut distinguer cette consultation de la décision rendue directement dans une affaire judiciaire et de l’édiction d’une règle générale.</w:t>
+      </w:r>
+    </w:p>
+    <w:p>
+      <w:pPr>
+        <w:pageBreakBefore w:val="0"/>
+      </w:pPr>
+      <w:r>
+        <w:t xml:space="preserve">Mandat : il s’agit d’une instruction adressée à un agent de l’administration, notamment à un gouverneur provincial. Le destinataire et la fonction de l’acte sont ici essentiels : l’empereur dirige l’action de ses agents. Les quatre catégories de constitutions impériales montrent ainsi que la production du droit passe par plusieurs activités, législative, judiciaire, consultative ou administrative. Le terme commun de constitution impériale désigne leur origine dans le pouvoir impérial ; il ne les rend pas identiques dans leur forme.</w:t>
       </w:r>
     </w:p>
     <w:p>
@@ -918,7 +890,7 @@
         <w:pageBreakBefore w:val="0"/>
       </w:pPr>
       <w:r>
-        <w:t xml:space="preserve">La grande science juridique classique perd de son dynamisme, mais les œuvres anciennes restent utilisées, copiées, résumées et adaptées. « Déclin » ne signifie donc pas disparition de tout droit ou de toute activité juridique.</w:t>
+        <w:t xml:space="preserve">La grande science juridique classique perd de son dynamisme, mais les œuvres anciennes restent utilisées, copiées, résumées et adaptées. « Déclin » ne signifie donc pas disparition de tout droit ou de toute activité juridique. La question devient notamment celle de l’accès aux œuvres et de la manière de les utiliser lorsqu’elles divergent. Cette difficulté prépare l’étude de la loi des citations et des recueils : les autorités cherchent à rendre un patrimoine juridique ancien plus maniable.</w:t>
       </w:r>
     </w:p>
     <w:p>
@@ -967,7 +939,7 @@
         <w:pageBreakBefore w:val="0"/>
       </w:pPr>
       <w:r>
-        <w:t xml:space="preserve">Elle reconnaît une autorité particulière à cinq juristes : Gaius, Papinien, Ulpien, Paul et Modestin. En cas de contradiction, la majorité est suivie ; en cas de partage égal, l’avis de Papinien prévaut. Si celui-ci ne s’est pas prononcé, le juge dispose d’une marge de choix.</w:t>
+        <w:t xml:space="preserve">Elle reconnaît une autorité particulière à cinq juristes : Gaius, Papinien, Ulpien, Paul et Modestin. En cas de contradiction, la majorité est suivie ; en cas de partage égal, l’avis de Papinien prévaut. Si celui-ci ne s’est pas prononcé, le juge dispose d’une marge de choix. Ce mécanisme cherche à orienter le juge dans un ensemble d’opinions concurrentes. Le nombre et l’autorité des auteurs deviennent des critères de choix. Exemple pédagogique : lorsque les opinions citées ne vont pas dans le même sens, la seule ancienneté d’un texte ne suffit pas ; il faut appliquer le mécanisme de résolution du désaccord prévu.</w:t>
       </w:r>
     </w:p>
     <w:p>
@@ -1056,42 +1028,34 @@
     </w:p>
     <w:p>
       <w:pPr>
-        <w:pStyle w:val="ListBullet"/>
-        <w:pageBreakBefore w:val="0"/>
-        <w:spacing w:after="40"/>
-      </w:pPr>
-      <w:r>
-        <w:t xml:space="preserve">Code : constitutions impériales ; première version en 529, version définitive en 534 ; douze livres.</w:t>
-      </w:r>
-    </w:p>
-    <w:p>
-      <w:pPr>
-        <w:pStyle w:val="ListBullet"/>
-        <w:pageBreakBefore w:val="0"/>
-        <w:spacing w:after="40"/>
-      </w:pPr>
-      <w:r>
-        <w:t xml:space="preserve">Digeste ou Pandectes : extraits d’œuvres des juristes classiques ; 533 ; cinquante livres.</w:t>
-      </w:r>
-    </w:p>
-    <w:p>
-      <w:pPr>
-        <w:pStyle w:val="ListBullet"/>
-        <w:pageBreakBefore w:val="0"/>
-        <w:spacing w:after="40"/>
-      </w:pPr>
-      <w:r>
-        <w:t xml:space="preserve">Institutes : manuel officiel d’enseignement, inspiré notamment de Gaius, doté d’autorité juridique ; 533 ; quatre livres.</w:t>
-      </w:r>
-    </w:p>
-    <w:p>
-      <w:pPr>
-        <w:pStyle w:val="ListBullet"/>
-        <w:pageBreakBefore w:val="0"/>
-        <w:spacing w:after="40"/>
-      </w:pPr>
-      <w:r>
-        <w:t xml:space="preserve">Novelles : constitutions impériales nouvelles postérieures à la version définitive du Code de 534 ; réunies notamment dans des collections privées et souvent rédigées en grec.</w:t>
+        <w:pageBreakBefore w:val="0"/>
+      </w:pPr>
+      <w:r>
+        <w:t xml:space="preserve">Code : constitutions impériales ; première version en 529, version définitive en 534, en douze livres. Son intérêt est de rassembler et d’ordonner des décisions des empereurs afin de les rendre utilisables comme référence. Le Code répond donc à la question de l’accès aux textes de législation impériale. Le retenir comme un simple titre dans une liste ferait perdre sa différence principale avec le Digeste : les matériaux réunis ne viennent pas du même type de source.</w:t>
+      </w:r>
+    </w:p>
+    <w:p>
+      <w:pPr>
+        <w:pageBreakBefore w:val="0"/>
+      </w:pPr>
+      <w:r>
+        <w:t xml:space="preserve">Digeste ou Pandectes : ce recueil de 533, en cinquante livres, rassemble des extraits d’œuvres des juristes classiques. Il donne accès à des raisonnements et à des solutions issus de la science juridique. Le travail de compilation suppose de sélectionner et d’organiser ces fragments ; certaines modifications destinées à les adapter constituent des interpolations. Le Digeste contribue donc à conserver le droit classique tout en le faisant servir au projet de Justinien.</w:t>
+      </w:r>
+    </w:p>
+    <w:p>
+      <w:pPr>
+        <w:pageBreakBefore w:val="0"/>
+      </w:pPr>
+      <w:r>
+        <w:t xml:space="preserve">Institutes : ce manuel officiel d’enseignement de 533, organisé en quatre livres et inspiré notamment de Gaius, présente le droit pour son apprentissage. Son objectif pédagogique le distingue de l’ample collection d’extraits savants du Digeste. Il possède également une autorité juridique : il ne faut donc pas l’assimiler à un simple livre scolaire privé. Pour mémoriser l’ensemble, on peut relier chaque recueil à son usage : apprendre les bases, retrouver les constitutions ou consulter les analyses des juristes.</w:t>
+      </w:r>
+    </w:p>
+    <w:p>
+      <w:pPr>
+        <w:pageBreakBefore w:val="0"/>
+      </w:pPr>
+      <w:r>
+        <w:t xml:space="preserve">Novelles : ce sont les constitutions impériales nouvelles postérieures à la version définitive du Code de 534. Elles montrent que la compilation ne met pas fin à l’activité normative de l’empereur : de nouvelles règles continuent d’être adoptées. Elles sont notamment transmises par des collections privées et souvent rédigées en grec. Leur place permet de comprendre le caractère évolutif de l’ensemble justinien : réunir les textes existants et produire des textes nouveaux constituent deux opérations distinctes.</w:t>
       </w:r>
     </w:p>
     <w:p>
@@ -1114,7 +1078,7 @@
         <w:pageBreakBefore w:val="0"/>
       </w:pPr>
       <w:r>
-        <w:t xml:space="preserve">La Novelle 118 de 543 réorganise la succession sans testament : la parenté par le sang, ou cognation, prend le pas sur d’anciennes distinctions agnatiques. Les descendants viennent en premier ; la représentation permet à certains descendants d’un enfant prédécédé de recueillir sa part. À défaut, ascendants, frères et sœurs, puis autres collatéraux sont appelés selon les règles prévues. Le conjoint survivant relève de règles particulières.</w:t>
+        <w:t xml:space="preserve">La Novelle 118 de 543 réorganise la succession sans testament : la parenté par le sang, ou cognation, prend le pas sur d’anciennes distinctions agnatiques. Les descendants viennent en premier ; la représentation permet à certains descendants d’un enfant prédécédé de recueillir sa part. À défaut, ascendants, frères et sœurs, puis autres collatéraux sont appelés selon les règles prévues. Le conjoint survivant relève de règles particulières. Cet exemple montre qu’une constitution nouvelle peut modifier une organisation familiale et successorale héritée. Pour comprendre la règle, il faut identifier le critère de parenté utilisé, puis l’ordre des personnes appelées ; apprendre uniquement le numéro de la Novelle ne suffit pas.</w:t>
       </w:r>
     </w:p>
     <w:p>
@@ -1294,7 +1258,7 @@
         <w:pageBreakBefore w:val="0"/>
       </w:pPr>
       <w:r>
-        <w:t xml:space="preserve">Elle est surtout un tarif de compositions, mais traite aussi famille, biens et procédure. Elle n’exclut pas les femmes de toute succession : une disposition concerne la terra Salica, dont le sens exact reste discuté. Son utilisation, à partir du XIVe siècle, dans la succession à la Couronne est un phénomène ultérieur.</w:t>
+        <w:t xml:space="preserve">Elle est surtout un tarif de compositions, mais traite aussi famille, biens et procédure. Elle n’exclut pas les femmes de toute succession : une disposition concerne la terra Salica, dont le sens exact reste discuté. Son utilisation, à partir du XIVe siècle, dans la succession à la Couronne est un phénomène ultérieur. Cet exemple montre qu’une règle ancienne peut recevoir un usage politique nouveau longtemps après sa rédaction. Pour éviter l’anachronisme, il faut distinguer le problème initial des biens et successions et la question beaucoup plus tardive de la transmission du pouvoir royal.</w:t>
       </w:r>
     </w:p>
     <w:p>
@@ -1383,15 +1347,15 @@
         <w:pageBreakBefore w:val="0"/>
       </w:pPr>
       <w:r>
-        <w:t xml:space="preserve">La loi personnelle dépend principalement de la naissance, avec des règles particulières pour l’enfant, l’affranchi, la femme mariée et les clercs. En cas de lois différentes entre parties, les règles de choix évoluent : le cours distingue notamment la loi du défendeur puis, progressivement, celle de la victime.</w:t>
-      </w:r>
-    </w:p>
-    <w:p>
-      <w:pPr>
-        <w:pageBreakBefore w:val="0"/>
-      </w:pPr>
-      <w:r>
-        <w:t xml:space="preserve">Les déplacements, mariages et mélanges des populations compliquent ce système. Le lieu de vie ou de jugement devient progressivement plus important : c’est la territorialisation. Ce mouvement ne signifie pas l’abolition soudaine de toutes les lois personnelles.</w:t>
+        <w:t xml:space="preserve">La loi personnelle dépend principalement de la naissance, avec des règles particulières pour l’enfant, l’affranchi, la femme mariée et les clercs. En cas de lois différentes entre parties, les règles de choix évoluent : le cours distingue notamment la loi du défendeur puis, progressivement, celle de la victime. La première question du procès est ainsi d’identifier la loi sous laquelle vivent les personnes. Ce travail ne se confond pas avec la recherche de la solution au fond : avant de discuter qui a raison, il faut déterminer les règles auxquelles se référer.</w:t>
+      </w:r>
+    </w:p>
+    <w:p>
+      <w:pPr>
+        <w:pageBreakBefore w:val="0"/>
+      </w:pPr>
+      <w:r>
+        <w:t xml:space="preserve">Les déplacements, mariages et mélanges des populations compliquent ce système. Le lieu de vie ou de jugement devient progressivement plus important : c’est la territorialisation. Ce mouvement ne signifie pas l’abolition soudaine de toutes les lois personnelles. Exemple pédagogique : lorsque des personnes de groupes différents vivent durablement dans un même lieu, le rattachement personnel peut devenir difficile à manier. La place croissante du territoire répond à cette difficulté pratique ; elle n’implique pas que tous les droits antérieurs aient été supprimés en même temps.</w:t>
       </w:r>
     </w:p>
     <w:p>
@@ -1418,7 +1382,7 @@
         <w:pageBreakBefore w:val="0"/>
       </w:pPr>
       <w:r>
-        <w:t xml:space="preserve">Le renforcement royal puis impérial redonne une place à la législation générale. La renaissance carolingienne favorise écoles, copie des manuscrits et recours aux conseillers. Charlemagne emploie des règles écrites pour gouverner un territoire étendu.</w:t>
+        <w:t xml:space="preserve">Le renforcement royal puis impérial redonne une place à la législation générale. La renaissance carolingienne favorise écoles, copie des manuscrits et recours aux conseillers. Charlemagne emploie des règles écrites pour gouverner un territoire étendu. Une autorité gouvernant des populations diverses a besoin de transmettre des instructions et de coordonner des comportements. Les capitulaires participent à cet effort. Leur développement doit être relié à l’exercice du gouvernement, sans supposer qu’un texte suffit à assurer partout une application identique.</w:t>
       </w:r>
     </w:p>
     <w:p>
@@ -1446,40 +1410,34 @@
     </w:p>
     <w:p>
       <w:pPr>
-        <w:pStyle w:val="ListBullet"/>
-        <w:pageBreakBefore w:val="0"/>
-        <w:spacing w:after="40"/>
-      </w:pPr>
-      <w:r>
-        <w:t xml:space="preserve">Capitulaires ajoutés aux lois des peuples : complètent ou modifient une loi personnelle.</w:t>
-      </w:r>
-    </w:p>
-    <w:p>
-      <w:pPr>
-        <w:pStyle w:val="ListBullet"/>
-        <w:pageBreakBefore w:val="0"/>
-        <w:spacing w:after="40"/>
-      </w:pPr>
-      <w:r>
-        <w:t xml:space="preserve">Capitulaires autonomes : édictent des règles indépendantes des anciennes lois personnelles, souvent dans une perspective plus territoriale.</w:t>
-      </w:r>
-    </w:p>
-    <w:p>
-      <w:pPr>
-        <w:pStyle w:val="ListBullet"/>
-        <w:pageBreakBefore w:val="0"/>
-        <w:spacing w:after="40"/>
-      </w:pPr>
-      <w:r>
-        <w:t xml:space="preserve">Capitulaires ecclésiastiques : concernent l’Église, sa discipline et ses relations avec le pouvoir.</w:t>
-      </w:r>
-    </w:p>
-    <w:p>
-      <w:pPr>
-        <w:pageBreakBefore w:val="0"/>
-      </w:pPr>
-      <w:r>
-        <w:t xml:space="preserve">Ces catégories ne rendent pas immédiatement tout le droit uniforme. L’édit de Pîtres de 864 illustre déjà la place du lieu où la justice est rendue dans la détermination des règles applicables.</w:t>
+        <w:pageBreakBefore w:val="0"/>
+      </w:pPr>
+      <w:r>
+        <w:t xml:space="preserve">Capitulaires ajoutés aux lois des peuples : ces textes complètent ou modifient une loi personnelle déjà applicable à un groupe. Le pouvoir royal intervient donc dans un cadre juridique existant, sans nécessairement le remplacer. Cette catégorie illustre la coexistence entre l’autorité normative du souverain et la diversité des lois des populations. Elle empêche d’assimiler toute législation carolingienne à la création immédiate d’un droit unique pour l’ensemble du territoire.</w:t>
+      </w:r>
+    </w:p>
+    <w:p>
+      <w:pPr>
+        <w:pageBreakBefore w:val="0"/>
+      </w:pPr>
+      <w:r>
+        <w:t xml:space="preserve">Capitulaires autonomes : ils édictent des règles indépendantes des anciennes lois personnelles, souvent dans une perspective plus territoriale. Leur intérêt est de permettre au souverain d’organiser des questions qui dépassent une seule loi de peuple. Il faut distinguer cette fonction de celle des capitulaires qui complètent une loi particulière. La coexistence des deux techniques explique la transition progressive vers des règles davantage attachées au territoire, plutôt qu’un changement général accompli en une seule décision.</w:t>
+      </w:r>
+    </w:p>
+    <w:p>
+      <w:pPr>
+        <w:pageBreakBefore w:val="0"/>
+      </w:pPr>
+      <w:r>
+        <w:t xml:space="preserve">Capitulaires ecclésiastiques : ils concernent l’Église, sa discipline et ses relations avec le pouvoir. Leur objet révèle l’imbrication des questions religieuses et du gouvernement dans le monde carolingien. Les catégories de capitulaires peuvent être décrites selon leur rapport aux anciennes lois ou selon la matière qu’elles traitent ; elles ne constituent donc pas toujours des catégories exclusives fondées sur un seul critère. Pour analyser un texte, il faut préciser son auteur, son objet et les personnes ou situations auxquelles il s’adresse.</w:t>
+      </w:r>
+    </w:p>
+    <w:p>
+      <w:pPr>
+        <w:pageBreakBefore w:val="0"/>
+      </w:pPr>
+      <w:r>
+        <w:t xml:space="preserve">Ces catégories ne rendent pas immédiatement tout le droit uniforme. L’édit de Pîtres de 864 illustre déjà la place du lieu où la justice est rendue dans la détermination des règles applicables. Il faut donc présenter le mouvement de territorialisation comme une évolution des critères de rattachement. La législation peut compléter les lois de groupes tout en faisant émerger des règles plus générales. Ces deux mouvements expliquent la persistance du pluralisme pendant la transformation du système.</w:t>
       </w:r>
     </w:p>
     <w:p>
@@ -1623,7 +1581,7 @@
         <w:pageBreakBefore w:val="0"/>
       </w:pPr>
       <w:r>
-        <w:t xml:space="preserve">La procédure franque est principalement accusatoire, orale et formaliste, avec une forte coloration pénale. Les paroles, formules et gestes doivent intervenir au moment et dans les formes attendues. Un prolocutor peut aider une partie à prononcer correctement sa demande.</w:t>
+        <w:t xml:space="preserve">La procédure franque est principalement accusatoire, orale et formaliste, avec une forte coloration pénale. Les paroles, formules et gestes doivent intervenir au moment et dans les formes attendues. Un prolocutor peut aider une partie à prononcer correctement sa demande. Le caractère oral et formaliste explique l’importance de celui qui maîtrise les paroles attendues. Une difficulté de procédure ne tient pas seulement à la preuve matérielle des faits ; elle peut aussi résulter de la manière de formuler correctement sa prétention.</w:t>
       </w:r>
     </w:p>
     <w:p>
@@ -1646,32 +1604,26 @@
     </w:p>
     <w:p>
       <w:pPr>
-        <w:pStyle w:val="ListBullet"/>
-        <w:pageBreakBefore w:val="0"/>
-        <w:spacing w:after="40"/>
-      </w:pPr>
-      <w:r>
-        <w:t xml:space="preserve">Preuves rationnelles : écrit, témoignage et aveu. L’écrit est plus rare, mais sa valeur ne disparaît pas.</w:t>
-      </w:r>
-    </w:p>
-    <w:p>
-      <w:pPr>
-        <w:pStyle w:val="ListBullet"/>
-        <w:pageBreakBefore w:val="0"/>
-        <w:spacing w:after="40"/>
-      </w:pPr>
-      <w:r>
-        <w:t xml:space="preserve">Serment purgatoire : la personne mise en cause jure pour se disculper. Honneur et statut contribuent à sa crédibilité.</w:t>
-      </w:r>
-    </w:p>
-    <w:p>
-      <w:pPr>
-        <w:pStyle w:val="ListBullet"/>
-        <w:pageBreakBefore w:val="0"/>
-        <w:spacing w:after="40"/>
-      </w:pPr>
-      <w:r>
-        <w:t xml:space="preserve">Co-jureurs : proches soutenant la moralité et la crédibilité du jureur. Ils ne témoignent pas nécessairement des faits.</w:t>
+        <w:pageBreakBefore w:val="0"/>
+      </w:pPr>
+      <w:r>
+        <w:t xml:space="preserve">Preuves rationnelles : l’écrit, le témoignage et l’aveu cherchent à renseigner la juridiction sur les faits. Leur présence montre que la procédure ne repose pas exclusivement sur des épreuves religieuses. Même si les écrits sont plus rares, leur valeur ne disparaît pas. Il faut examiner le moyen utilisé dans son contexte, sans supposer que toutes les affaires sont jugées par ordalie ou que la rareté d’un document conduit automatiquement à une épreuve.</w:t>
+      </w:r>
+    </w:p>
+    <w:p>
+      <w:pPr>
+        <w:pageBreakBefore w:val="0"/>
+      </w:pPr>
+      <w:r>
+        <w:t xml:space="preserve">Serment purgatoire : la personne mise en cause jure afin de se disculper. Le mécanisme repose sur la valeur accordée à sa parole, à son honneur et à son statut. Le serment n’est donc pas un témoignage extérieur décrivant directement les faits du litige. Cette différence explique la place des co-jureurs : ils peuvent soutenir la crédibilité de celui qui jure sans avoir nécessairement assisté à l’événement contesté.</w:t>
+      </w:r>
+    </w:p>
+    <w:p>
+      <w:pPr>
+        <w:pageBreakBefore w:val="0"/>
+      </w:pPr>
+      <w:r>
+        <w:t xml:space="preserve">Co-jureurs : ce sont des proches qui soutiennent la moralité et la crédibilité du jureur. Ils ne témoignent pas nécessairement des faits. Exemple pédagogique : confirmer qu’une personne est digne de foi n’équivaut pas à affirmer avoir vu l’acte qu’on lui reproche. Cette distinction est essentielle pour éviter de transformer les co-jureurs en témoins ordinaires. Le procédé révèle une manière d’établir le bon droit qui accorde une place importante à la réputation et aux relations sociales.</w:t>
       </w:r>
     </w:p>
     <w:p>
@@ -1737,7 +1689,7 @@
         <w:pageBreakBefore w:val="0"/>
       </w:pPr>
       <w:r>
-        <w:t xml:space="preserve">Les sanctions privées tendent notamment à réparer et pacifier ; les sanctions publiques répriment une atteinte à l’ordre et à l’autorité. Ces fonctions peuvent se combiner. Les tarifs de compositions reflètent les inégalités de statut.</w:t>
+        <w:t xml:space="preserve">Les sanctions privées tendent notamment à réparer et pacifier ; les sanctions publiques répriment une atteinte à l’ordre et à l’autorité. Ces fonctions peuvent se combiner. Les tarifs de compositions reflètent les inégalités de statut. La composition cherche à interrompre l’enchaînement des violences, tandis que la part liée à la paix publique exprime l’intérêt de l’autorité. Leur coexistence permet de comprendre comment un même litige peut concerner à la fois la victime, son groupe et le pouvoir politique.</w:t>
       </w:r>
     </w:p>
     <w:p>
@@ -1853,7 +1805,7 @@
         <w:pageBreakBefore w:val="0"/>
       </w:pPr>
       <w:r>
-        <w:t xml:space="preserve">La coutume est un usage tenu pour juridiquement obligatoire. Elle devient de plus en plus attachée à un territoire et joue un rôle majeur pour les biens, successions et rapports familiaux. Sa transmission orale pose la question de la preuve de son existence et de son contenu.</w:t>
+        <w:t xml:space="preserve">La coutume est un usage tenu pour juridiquement obligatoire. Elle devient de plus en plus attachée à un territoire et joue un rôle majeur pour les biens, successions et rapports familiaux. Sa transmission orale pose la question de la preuve de son existence et de son contenu. Exemple pédagogique : les parties peuvent s’opposer sur le contenu d’un usage successoral avant même de discuter l’attribution d’un bien. Il faut alors établir la règle invoquée. La difficulté n’est pas seulement de prouver les faits du litige ; elle porte sur l’existence et le sens d’une norme coutumière.</w:t>
       </w:r>
     </w:p>
     <w:p>
@@ -1891,7 +1843,7 @@
         <w:pageBreakBefore w:val="0"/>
       </w:pPr>
       <w:r>
-        <w:t xml:space="preserve">Louis IX réglemente l’enquête par turbe en 1270. Elle se développe particulièrement au Nord ; dans le Midi, le témoignage individuel conserve une place. Mémoire et influences sur les personnes consultées limitent la fiabilité. La preuve de la coutume, qui porte sur la règle, doit être distinguée de la preuve des faits.</w:t>
+        <w:t xml:space="preserve">Louis IX réglemente l’enquête par turbe en 1270. Elle se développe particulièrement au Nord ; dans le Midi, le témoignage individuel conserve une place. Mémoire et influences sur les personnes consultées limitent la fiabilité. La preuve de la coutume, qui porte sur la règle, doit être distinguée de la preuve des faits. L’enquête cherche donc à faire connaître une règle par ceux qui sont réputés la maîtriser. Elle ne crée pas automatiquement une coutume nouvelle et ne tranche pas à elle seule tous les faits de l’affaire. Comprendre sa fonction permet de la distinguer d’un vote législatif ou d’une simple audition de témoins sur un événement.</w:t>
       </w:r>
     </w:p>
     <w:p>
@@ -1947,7 +1899,7 @@
         <w:pageBreakBefore w:val="0"/>
       </w:pPr>
       <w:r>
-        <w:t xml:space="preserve">Les Coutumes de Beauvaisis de Beaumanoir, rédigées en 1283, comptent soixante-dix chapitres en ancien français. Son expérience de bailli et les droits savants nourrissent la comparaison des règles et la recherche de solutions : l’ouvrage dépasse un simple inventaire.</w:t>
+        <w:t xml:space="preserve">Les Coutumes de Beauvaisis de Beaumanoir, rédigées en 1283, comptent soixante-dix chapitres en ancien français. Son expérience de bailli et les droits savants nourrissent la comparaison des règles et la recherche de solutions : l’ouvrage dépasse un simple inventaire. Son intérêt ne se limite donc pas à conserver des usages. Il cherche également à comprendre les règles et à résoudre des difficultés en mobilisant l’expérience judiciaire et la comparaison. Cette démarche rapproche l’activité du praticien et les méthodes savantes sans rendre automatiquement tout coutumier officiel.</w:t>
       </w:r>
     </w:p>
     <w:p>
@@ -1995,32 +1947,26 @@
     </w:p>
     <w:p>
       <w:pPr>
-        <w:pStyle w:val="ListBullet"/>
-        <w:pageBreakBefore w:val="0"/>
-        <w:spacing w:after="40"/>
-      </w:pPr>
-      <w:r>
-        <w:t xml:space="preserve">Facteur politique : les rivalités entre empereur et papauté stimulent la recherche d’arguments juridiques sur l’autorité.</w:t>
-      </w:r>
-    </w:p>
-    <w:p>
-      <w:pPr>
-        <w:pStyle w:val="ListBullet"/>
-        <w:pageBreakBefore w:val="0"/>
-        <w:spacing w:after="40"/>
-      </w:pPr>
-      <w:r>
-        <w:t xml:space="preserve">Facteur universitaire : écoles, lecture des textes, grammaire et dialectique favorisent un travail spécialisé.</w:t>
-      </w:r>
-    </w:p>
-    <w:p>
-      <w:pPr>
-        <w:pStyle w:val="ListBullet"/>
-        <w:pageBreakBefore w:val="0"/>
-        <w:spacing w:after="40"/>
-      </w:pPr>
-      <w:r>
-        <w:t xml:space="preserve">Facteur économique : essor des villes, échanges, contrats et besoins de règlement des conflits.</w:t>
+        <w:pageBreakBefore w:val="0"/>
+      </w:pPr>
+      <w:r>
+        <w:t xml:space="preserve">Le facteur politique tient notamment aux rivalités entre empereur et papauté. Les autorités et leurs conseillers recherchent dans les textes des arguments sur l’origine, la portée et les limites du pouvoir. Les compilations romaines représentent ainsi un matériau utile pour discuter des prétentions d’autorité. Ce contexte explique l’intérêt porté à leur étude, mais ne suffit pas, à lui seul, à expliquer la formation d’un enseignement juridique spécialisé.</w:t>
+      </w:r>
+    </w:p>
+    <w:p>
+      <w:pPr>
+        <w:pageBreakBefore w:val="0"/>
+      </w:pPr>
+      <w:r>
+        <w:t xml:space="preserve">Le facteur universitaire correspond au développement des écoles et du travail méthodique sur les textes. La lecture, la grammaire et la dialectique donnent des outils pour comprendre les mots, rapprocher des passages et discuter des contradictions apparentes. Le droit devient un objet d’étude organisé autour de maîtres et de méthodes. Il faut donc distinguer la conservation matérielle d’un texte et sa transformation en support d’un enseignement savant.</w:t>
+      </w:r>
+    </w:p>
+    <w:p>
+      <w:pPr>
+        <w:pageBreakBefore w:val="0"/>
+      </w:pPr>
+      <w:r>
+        <w:t xml:space="preserve">Le facteur économique est lié à l’essor des villes et des échanges. Les contrats, la circulation des biens et les conflits entre acteurs créent des besoins de raisonnement et de règlement. Les textes romains fournissent des catégories et des solutions que les juristes peuvent étudier et mobiliser. Ces besoins n’expliquent pas une copie automatique du droit antique : ils contribuent à comprendre pourquoi des praticiens s’intéressent à des analyses susceptibles d’éclairer les problèmes de leur temps.</w:t>
       </w:r>
     </w:p>
     <w:p>
@@ -2051,7 +1997,7 @@
         <w:pageBreakBefore w:val="0"/>
       </w:pPr>
       <w:r>
-        <w:t xml:space="preserve">Pépo et Irnerius figurent parmi les premiers maîtres ; leurs biographies restent mal connues. Les glossateurs de Bologne, dont les quatre docteurs Bulgarus, Martinus, Jacobus et Hugo, développent et diffusent la méthode. La Grande Glose d’Accurse, au XIIIe siècle, rassemble les commentaires antérieurs.</w:t>
+        <w:t xml:space="preserve">Pépo et Irnerius figurent parmi les premiers maîtres ; leurs biographies restent mal connues. Les glossateurs de Bologne, dont les quatre docteurs Bulgarus, Martinus, Jacobus et Hugo, développent et diffusent la méthode. La Grande Glose d’Accurse, au XIIIe siècle, rassemble les commentaires antérieurs. Leur méthode commence par l’explication du texte et de son vocabulaire. La mise en commun des gloses permet d’accumuler et d’ordonner les interprétations. La Grande Glose illustre ainsi une construction savante progressive, et non la promulgation d’un code nouveau par l’autorité politique.</w:t>
       </w:r>
     </w:p>
     <w:p>
@@ -2074,7 +2020,7 @@
         <w:pageBreakBefore w:val="0"/>
       </w:pPr>
       <w:r>
-        <w:t xml:space="preserve">Jacques de Révigny et Pierre de Belleperche à Orléans, puis Bartole et Balde en Italie, illustrent cette évolution. Le bartolisme discute les arguments pour et contre une solution sans modifier matériellement les anciens codes.</w:t>
+        <w:t xml:space="preserve">Jacques de Révigny et Pierre de Belleperche à Orléans, puis Bartole et Balde en Italie, illustrent cette évolution. Le bartolisme discute les arguments pour et contre une solution sans modifier matériellement les anciens codes. Le changement de méthode tient notamment à la place donnée aux difficultés pratiques. Les juristes travaillent à partir de textes anciens, mais cherchent à les rendre utiles pour des situations de leur temps. Cette activité d’interprétation doit être distinguée d’une modification matérielle des textes de Justinien.</w:t>
       </w:r>
     </w:p>
     <w:p>
@@ -2164,7 +2110,7 @@
         <w:pageBreakBefore w:val="0"/>
       </w:pPr>
       <w:r>
-        <w:t xml:space="preserve">Son titre, Concordia discordantium canonum, renvoie à la concorde de canons discordants. La méthode distingue autorité, ancienneté, objet et circonstances pour préciser les conditions d’application. L’ouvrage devient une base de l’enseignement canonique.</w:t>
+        <w:t xml:space="preserve">Son titre, Concordia discordantium canonum, renvoie à la concorde de canons discordants. La méthode distingue autorité, ancienneté, objet et circonstances pour préciser les conditions d’application. L’ouvrage devient une base de l’enseignement canonique. Exemple pédagogique : deux prescriptions formulées différemment peuvent viser des personnes ou des circonstances distinctes. Le juriste doit d’abord identifier leurs conditions d’application avant de conclure à une contradiction. Cette manière de travailler éclaire le rôle de la doctrine dans l’organisation d’un droit composé de nombreuses sources.</w:t>
       </w:r>
     </w:p>
     <w:p>
@@ -2199,42 +2145,34 @@
     </w:p>
     <w:p>
       <w:pPr>
-        <w:pStyle w:val="ListBullet"/>
-        <w:pageBreakBefore w:val="0"/>
-        <w:spacing w:after="40"/>
-      </w:pPr>
-      <w:r>
-        <w:t xml:space="preserve">1234 : Décrétales de Grégoire IX ou Liber extra, préparées par Raymond de Peñafort ; recueil officiel en cinq livres.</w:t>
-      </w:r>
-    </w:p>
-    <w:p>
-      <w:pPr>
-        <w:pStyle w:val="ListBullet"/>
-        <w:pageBreakBefore w:val="0"/>
-        <w:spacing w:after="40"/>
-      </w:pPr>
-      <w:r>
-        <w:t xml:space="preserve">1298 : Sexte ou Liber sextus de Boniface VIII, prolongeant les collections précédentes.</w:t>
-      </w:r>
-    </w:p>
-    <w:p>
-      <w:pPr>
-        <w:pStyle w:val="ListBullet"/>
-        <w:pageBreakBefore w:val="0"/>
-        <w:spacing w:after="40"/>
-      </w:pPr>
-      <w:r>
-        <w:t xml:space="preserve">1314 puis 1317 : Clémentines ; la diffusion officielle sous Jean XXII est rattachée à 1317.</w:t>
-      </w:r>
-    </w:p>
-    <w:p>
-      <w:pPr>
-        <w:pStyle w:val="ListBullet"/>
-        <w:pageBreakBefore w:val="0"/>
-        <w:spacing w:after="40"/>
-      </w:pPr>
-      <w:r>
-        <w:t xml:space="preserve">Extravagantes : collections de décrétales restées en dehors des recueils antérieurs.</w:t>
+        <w:pageBreakBefore w:val="0"/>
+      </w:pPr>
+      <w:r>
+        <w:t xml:space="preserve">En 1234, les Décrétales de Grégoire IX, ou Liber extra, sont préparées par Raymond de Peñafort et réunies officiellement en cinq livres. À la différence du Décret de Gratien, l’intervention de l’autorité pontificale donne à ce recueil un statut officiel. Cette différence ne porte pas sur l’utilité pratique de l’œuvre, mais sur son mode de production et son autorité. Elle est essentielle pour distinguer une construction doctrinale et une compilation officiellement promulguée.</w:t>
+      </w:r>
+    </w:p>
+    <w:p>
+      <w:pPr>
+        <w:pageBreakBefore w:val="0"/>
+      </w:pPr>
+      <w:r>
+        <w:t xml:space="preserve">En 1298, le Sexte, ou Liber sextus, de Boniface VIII prolonge les collections précédentes. Le qualificatif de sixième livre permet de le situer par rapport aux cinq livres du Liber extra. Il ne signifie pas que le Décret de Gratien serait devenu une sixième loi pontificale. Ce prolongement montre que le droit canonique continue de produire et d’ordonner des textes après les grandes collections du XIIIe siècle.</w:t>
+      </w:r>
+    </w:p>
+    <w:p>
+      <w:pPr>
+        <w:pageBreakBefore w:val="0"/>
+      </w:pPr>
+      <w:r>
+        <w:t xml:space="preserve">Les Clémentines sont rattachées à 1314 puis à leur diffusion officielle sous Jean XXII en 1317. Pour réviser, il faut distinguer l’histoire de la préparation d’un recueil et celle de sa publication ou de sa diffusion officielle. Une suite de dates devient ainsi une explication de la formation des sources. Il faut les replacer après le Liber extra et le Sexte, sans confondre les différents recueils ni leurs autorités.</w:t>
+      </w:r>
+    </w:p>
+    <w:p>
+      <w:pPr>
+        <w:pageBreakBefore w:val="0"/>
+      </w:pPr>
+      <w:r>
+        <w:t xml:space="preserve">Les Extravagantes réunissent des décrétales restées en dehors des recueils antérieurs. Le mot désigne leur place à l’extérieur de ces collections, et non une absence de contenu juridique. Elles montrent que l’existence de grands recueils ne fait pas disparaître toute production nouvelle. L’ensemble canonique se constitue progressivement à partir de textes de natures et d’autorités différentes : il faut donc préciser la collection étudiée avant d’en présenter la portée.</w:t>
       </w:r>
     </w:p>
     <w:p>
@@ -2276,7 +2214,7 @@
         <w:pageBreakBefore w:val="0"/>
       </w:pPr>
       <w:r>
-        <w:t xml:space="preserve">La production des capitulaires s’affaiblit à la fin du IXe siècle. Jusqu’au milieu du XIIe siècle, la législation royale générale connaît une éclipse. Les rois continuent d’accorder diplômes, privilèges et confirmations : ce n’est pas une disparition de tous les actes royaux.</w:t>
+        <w:t xml:space="preserve">La production des capitulaires s’affaiblit à la fin du IXe siècle. Jusqu’au milieu du XIIe siècle, la législation royale générale connaît une éclipse. Les rois continuent d’accorder diplômes, privilèges et confirmations : ce n’est pas une disparition de tous les actes royaux. Il faut distinguer la production d’une règle générale et l’octroi d’un acte particulier à un bénéficiaire. Cette différence explique comment la monarchie peut continuer d’agir juridiquement alors que sa capacité à légiférer pour l’ensemble du royaume reste limitée.</w:t>
       </w:r>
     </w:p>
     <w:p>
@@ -2292,7 +2230,7 @@
         <w:pageBreakBefore w:val="0"/>
       </w:pPr>
       <w:r>
-        <w:t xml:space="preserve">En 1155, Louis VII proclame à Soissons une paix de dix ans avec l’appui de prélats et grands seigneurs. Le texte dépasse le seul domaine royal, mais son application dépend encore de leur engagement. Il ne supprime pas définitivement toutes les guerres privées.</w:t>
+        <w:t xml:space="preserve">En 1155, Louis VII proclame à Soissons une paix de dix ans avec l’appui de prélats et grands seigneurs. Le texte dépasse le seul domaine royal, mais son application dépend encore de leur engagement. Il ne supprime pas définitivement toutes les guerres privées. Le recours à l’appui des grands montre les limites et les possibilités de l’autorité royale. Le roi porte une mesure d’intérêt général, mais sa réalisation repose encore sur une coopération politique. L’exemple permet ainsi d’expliquer une reconstruction progressive du pouvoir législatif.</w:t>
       </w:r>
     </w:p>
     <w:p>
@@ -3107,7 +3045,7 @@
         <w:pageBreakBefore w:val="0"/>
       </w:pPr>
       <w:r>
-        <w:t xml:space="preserve">Fiche préparée le 13 octobre 2026. Les bornes historiques et les datations discutées sont conservées avec leurs nuances ; la suite du semestre pourra être ajoutée à partir des nouveaux cours.</w:t>
+        <w:t xml:space="preserve">Fiche préparée le 13 octobre 2026, puis développée le 14 octobre 2026 pour expliquer davantage les mécanismes et leurs liens. Les développements restent dans le cours actuel jusqu’au CM5 ; les exemples pédagogiques ajoutés sont signalés et l’archive reste séparée.</w:t>
       </w:r>
     </w:p>
     <w:sectPr>

</xml_diff>